<commit_message>
Feat: added creating default categories on start
</commit_message>
<xml_diff>
--- a/FinanceManager/Курсовой проект.docx
+++ b/FinanceManager/Курсовой проект.docx
@@ -456,258 +456,286 @@
         </w:rPr>
         <w:t xml:space="preserve">) была создана </w:t>
       </w:r>
+      <w:r>
+        <w:rPr>
+          <w:sz w:val="28"/>
+          <w:szCs w:val="28"/>
+          <w:lang w:val="en-US"/>
+        </w:rPr>
+        <w:t>Relay</w:t>
+      </w:r>
+      <w:r>
+        <w:rPr>
+          <w:sz w:val="28"/>
+          <w:szCs w:val="28"/>
+        </w:rPr>
+        <w:t xml:space="preserve"> </w:t>
+      </w:r>
+      <w:r>
+        <w:rPr>
+          <w:sz w:val="28"/>
+          <w:szCs w:val="28"/>
+          <w:lang w:val="en-US"/>
+        </w:rPr>
+        <w:t>Command</w:t>
+      </w:r>
+      <w:r>
+        <w:rPr>
+          <w:sz w:val="28"/>
+          <w:szCs w:val="28"/>
+        </w:rPr>
+        <w:t xml:space="preserve">, через которую можно будет в будущем удобно привязывать к кнопкам действия, которые будут прописаны в </w:t>
+      </w:r>
+      <w:r>
+        <w:rPr>
+          <w:sz w:val="28"/>
+          <w:szCs w:val="28"/>
+          <w:lang w:val="en-US"/>
+        </w:rPr>
+        <w:t>MVM</w:t>
+      </w:r>
+      <w:r>
+        <w:rPr>
+          <w:sz w:val="28"/>
+          <w:szCs w:val="28"/>
+        </w:rPr>
+        <w:t xml:space="preserve">. </w:t>
+      </w:r>
+    </w:p>
+    <w:p>
+      <w:pPr>
+        <w:rPr>
+          <w:sz w:val="28"/>
+          <w:szCs w:val="28"/>
+        </w:rPr>
+      </w:pPr>
+      <w:r>
+        <w:rPr>
+          <w:sz w:val="28"/>
+          <w:szCs w:val="28"/>
+        </w:rPr>
+        <w:t xml:space="preserve">В моделях было решено изменить значения, связанные с деньгами заменить с </w:t>
+      </w:r>
+      <w:r>
+        <w:rPr>
+          <w:sz w:val="28"/>
+          <w:szCs w:val="28"/>
+          <w:lang w:val="en-US"/>
+        </w:rPr>
+        <w:t>Decimal</w:t>
+      </w:r>
+      <w:r>
+        <w:rPr>
+          <w:sz w:val="28"/>
+          <w:szCs w:val="28"/>
+        </w:rPr>
+        <w:t xml:space="preserve"> (число с дробным значением) на </w:t>
+      </w:r>
+      <w:r>
+        <w:rPr>
+          <w:sz w:val="28"/>
+          <w:szCs w:val="28"/>
+          <w:lang w:val="en-US"/>
+        </w:rPr>
+        <w:t>Integer</w:t>
+      </w:r>
+      <w:r>
+        <w:rPr>
+          <w:sz w:val="28"/>
+          <w:szCs w:val="28"/>
+        </w:rPr>
+        <w:t xml:space="preserve"> (простое число), во избежание просчётов. В итоге были созданы все остальные модели для баз данных, которых всего пять: пользователи, транзакции, повторяющиеся транзакции, бюджет и категории. </w:t>
+      </w:r>
+    </w:p>
+    <w:p>
+      <w:pPr>
+        <w:rPr>
+          <w:sz w:val="28"/>
+          <w:szCs w:val="28"/>
+        </w:rPr>
+      </w:pPr>
+      <w:r>
+        <w:rPr>
+          <w:sz w:val="28"/>
+          <w:szCs w:val="28"/>
+        </w:rPr>
+        <w:lastRenderedPageBreak/>
+        <w:t>Потом я н</w:t>
+      </w:r>
+      <w:r>
+        <w:rPr>
+          <w:sz w:val="28"/>
+          <w:szCs w:val="28"/>
+        </w:rPr>
+        <w:t xml:space="preserve">ачал создавать </w:t>
+      </w:r>
+      <w:r>
+        <w:rPr>
+          <w:sz w:val="28"/>
+          <w:szCs w:val="28"/>
+        </w:rPr>
+        <w:t xml:space="preserve">методы для трат и бюджета, пока только добавление, но в скором времени и другие. </w:t>
+      </w:r>
+    </w:p>
+    <w:p>
+      <w:pPr>
+        <w:rPr>
+          <w:sz w:val="28"/>
+          <w:szCs w:val="28"/>
+        </w:rPr>
+      </w:pPr>
+      <w:r>
+        <w:rPr>
+          <w:sz w:val="28"/>
+          <w:szCs w:val="28"/>
+        </w:rPr>
+        <w:t xml:space="preserve">С первой проблемой с которой я столкнулся при создании – это перенос базы данных с </w:t>
+      </w:r>
+      <w:r>
+        <w:rPr>
+          <w:sz w:val="28"/>
+          <w:szCs w:val="28"/>
+          <w:lang w:val="en-US"/>
+        </w:rPr>
+        <w:t>MySQL</w:t>
+      </w:r>
+      <w:r>
+        <w:rPr>
+          <w:sz w:val="28"/>
+          <w:szCs w:val="28"/>
+        </w:rPr>
+        <w:t xml:space="preserve"> на </w:t>
+      </w:r>
+      <w:r>
+        <w:rPr>
+          <w:sz w:val="28"/>
+          <w:szCs w:val="28"/>
+          <w:lang w:val="en-US"/>
+        </w:rPr>
+        <w:t>PostgreSQL</w:t>
+      </w:r>
+      <w:r>
+        <w:rPr>
+          <w:sz w:val="28"/>
+          <w:szCs w:val="28"/>
+        </w:rPr>
+        <w:t xml:space="preserve">. Сначала я не мог её перенести из-за непонимания как работает </w:t>
+      </w:r>
+      <w:r>
+        <w:rPr>
+          <w:sz w:val="28"/>
+          <w:szCs w:val="28"/>
+          <w:lang w:val="en-US"/>
+        </w:rPr>
+        <w:t>PostgreSQL</w:t>
+      </w:r>
+      <w:r>
+        <w:rPr>
+          <w:sz w:val="28"/>
+          <w:szCs w:val="28"/>
+        </w:rPr>
+        <w:t xml:space="preserve">, ведь она явно сложнее в использовании, поэтому я начал разбираться. Для её </w:t>
+      </w:r>
+      <w:r>
+        <w:rPr>
+          <w:sz w:val="28"/>
+          <w:szCs w:val="28"/>
+        </w:rPr>
+        <w:t xml:space="preserve">внедрения в проект я скачал </w:t>
+      </w:r>
+      <w:r>
+        <w:rPr>
+          <w:sz w:val="28"/>
+          <w:szCs w:val="28"/>
+          <w:lang w:val="en-US"/>
+        </w:rPr>
+        <w:t>PostgreSQL</w:t>
+      </w:r>
+      <w:r>
+        <w:rPr>
+          <w:sz w:val="28"/>
+          <w:szCs w:val="28"/>
+        </w:rPr>
+        <w:t xml:space="preserve"> с сайта </w:t>
+      </w:r>
+      <w:proofErr w:type="spellStart"/>
+      <w:r>
+        <w:rPr>
+          <w:sz w:val="28"/>
+          <w:szCs w:val="28"/>
+        </w:rPr>
+        <w:t>EnterpriseDB</w:t>
+      </w:r>
+      <w:proofErr w:type="spellEnd"/>
+      <w:r>
+        <w:rPr>
+          <w:sz w:val="28"/>
+          <w:szCs w:val="28"/>
+        </w:rPr>
+        <w:t xml:space="preserve">, через командную строку создал базу данных и для отображения таблиц в ней я пользовался </w:t>
+      </w:r>
+      <w:proofErr w:type="spellStart"/>
+      <w:r>
+        <w:rPr>
+          <w:sz w:val="28"/>
+          <w:szCs w:val="28"/>
+          <w:lang w:val="en-US"/>
+        </w:rPr>
+        <w:t>PgAdmin</w:t>
+      </w:r>
+      <w:proofErr w:type="spellEnd"/>
+      <w:r>
+        <w:rPr>
+          <w:sz w:val="28"/>
+          <w:szCs w:val="28"/>
+        </w:rPr>
+        <w:t xml:space="preserve"> 4 и создал одну миграцию для всех таблиц сразу. </w:t>
+      </w:r>
+    </w:p>
+    <w:p>
+      <w:pPr>
+        <w:rPr>
+          <w:sz w:val="28"/>
+          <w:szCs w:val="28"/>
+        </w:rPr>
+      </w:pPr>
+      <w:r>
+        <w:rPr>
+          <w:sz w:val="28"/>
+          <w:szCs w:val="28"/>
+        </w:rPr>
+        <w:t>После чего з</w:t>
+      </w:r>
+      <w:r>
+        <w:rPr>
+          <w:sz w:val="28"/>
+          <w:szCs w:val="28"/>
+        </w:rPr>
+        <w:t xml:space="preserve">анялся отображением </w:t>
+      </w:r>
+      <w:r>
+        <w:rPr>
+          <w:sz w:val="28"/>
+          <w:szCs w:val="28"/>
+        </w:rPr>
+        <w:t>списка категорий и сортиров</w:t>
+      </w:r>
+      <w:r>
+        <w:rPr>
+          <w:sz w:val="28"/>
+          <w:szCs w:val="28"/>
+        </w:rPr>
+        <w:t>кой</w:t>
+      </w:r>
+      <w:r>
+        <w:rPr>
+          <w:sz w:val="28"/>
+          <w:szCs w:val="28"/>
+        </w:rPr>
+        <w:t xml:space="preserve"> транзакций по дате и категориям.</w:t>
+      </w:r>
       <w:bookmarkStart w:id="0" w:name="_GoBack"/>
       <w:bookmarkEnd w:id="0"/>
-      <w:r>
-        <w:rPr>
-          <w:sz w:val="28"/>
-          <w:szCs w:val="28"/>
-          <w:lang w:val="en-US"/>
-        </w:rPr>
-        <w:t>Relay</w:t>
-      </w:r>
-      <w:r>
-        <w:rPr>
-          <w:sz w:val="28"/>
-          <w:szCs w:val="28"/>
-        </w:rPr>
-        <w:t xml:space="preserve"> </w:t>
-      </w:r>
-      <w:r>
-        <w:rPr>
-          <w:sz w:val="28"/>
-          <w:szCs w:val="28"/>
-          <w:lang w:val="en-US"/>
-        </w:rPr>
-        <w:t>Command</w:t>
-      </w:r>
-      <w:r>
-        <w:rPr>
-          <w:sz w:val="28"/>
-          <w:szCs w:val="28"/>
-        </w:rPr>
-        <w:t xml:space="preserve">, через которую можно будет в будущем удобно привязывать к кнопкам действия, которые будут прописаны в </w:t>
-      </w:r>
-      <w:r>
-        <w:rPr>
-          <w:sz w:val="28"/>
-          <w:szCs w:val="28"/>
-          <w:lang w:val="en-US"/>
-        </w:rPr>
-        <w:t>MVM</w:t>
-      </w:r>
-      <w:r>
-        <w:rPr>
-          <w:sz w:val="28"/>
-          <w:szCs w:val="28"/>
-        </w:rPr>
-        <w:t xml:space="preserve">. </w:t>
-      </w:r>
-    </w:p>
-    <w:p>
-      <w:pPr>
-        <w:rPr>
-          <w:sz w:val="28"/>
-          <w:szCs w:val="28"/>
-        </w:rPr>
-      </w:pPr>
-      <w:r>
-        <w:rPr>
-          <w:sz w:val="28"/>
-          <w:szCs w:val="28"/>
-        </w:rPr>
-        <w:t xml:space="preserve">В моделях было решено изменить значения, связанные с деньгами заменить с </w:t>
-      </w:r>
-      <w:r>
-        <w:rPr>
-          <w:sz w:val="28"/>
-          <w:szCs w:val="28"/>
-          <w:lang w:val="en-US"/>
-        </w:rPr>
-        <w:t>Decimal</w:t>
-      </w:r>
-      <w:r>
-        <w:rPr>
-          <w:sz w:val="28"/>
-          <w:szCs w:val="28"/>
-        </w:rPr>
-        <w:t xml:space="preserve"> (число с дробным значением) на </w:t>
-      </w:r>
-      <w:r>
-        <w:rPr>
-          <w:sz w:val="28"/>
-          <w:szCs w:val="28"/>
-          <w:lang w:val="en-US"/>
-        </w:rPr>
-        <w:t>Integer</w:t>
-      </w:r>
-      <w:r>
-        <w:rPr>
-          <w:sz w:val="28"/>
-          <w:szCs w:val="28"/>
-        </w:rPr>
-        <w:t xml:space="preserve"> (простое число), во избежание просчётов. В итоге были созданы все остальные модели для баз данных, которых всего пять: пользователи, транзакции, повторяющиеся транзакции, бюджет и категории. </w:t>
-      </w:r>
-    </w:p>
-    <w:p>
-      <w:pPr>
-        <w:rPr>
-          <w:sz w:val="28"/>
-          <w:szCs w:val="28"/>
-        </w:rPr>
-      </w:pPr>
-      <w:r>
-        <w:rPr>
-          <w:sz w:val="28"/>
-          <w:szCs w:val="28"/>
-        </w:rPr>
-        <w:lastRenderedPageBreak/>
-        <w:t xml:space="preserve">Начал создавать </w:t>
-      </w:r>
-      <w:r>
-        <w:rPr>
-          <w:sz w:val="28"/>
-          <w:szCs w:val="28"/>
-        </w:rPr>
-        <w:t xml:space="preserve">методы для трат и бюджета, пока только добавление, но в скором времени и другие. </w:t>
-      </w:r>
-    </w:p>
-    <w:p>
-      <w:pPr>
-        <w:rPr>
-          <w:sz w:val="28"/>
-          <w:szCs w:val="28"/>
-        </w:rPr>
-      </w:pPr>
-      <w:r>
-        <w:rPr>
-          <w:sz w:val="28"/>
-          <w:szCs w:val="28"/>
-        </w:rPr>
-        <w:t xml:space="preserve">С первой проблемой с которой я столкнулся при создании – это перенос базы данных с </w:t>
-      </w:r>
-      <w:r>
-        <w:rPr>
-          <w:sz w:val="28"/>
-          <w:szCs w:val="28"/>
-          <w:lang w:val="en-US"/>
-        </w:rPr>
-        <w:t>MySQL</w:t>
-      </w:r>
-      <w:r>
-        <w:rPr>
-          <w:sz w:val="28"/>
-          <w:szCs w:val="28"/>
-        </w:rPr>
-        <w:t xml:space="preserve"> на </w:t>
-      </w:r>
-      <w:r>
-        <w:rPr>
-          <w:sz w:val="28"/>
-          <w:szCs w:val="28"/>
-          <w:lang w:val="en-US"/>
-        </w:rPr>
-        <w:t>PostgreSQL</w:t>
-      </w:r>
-      <w:r>
-        <w:rPr>
-          <w:sz w:val="28"/>
-          <w:szCs w:val="28"/>
-        </w:rPr>
-        <w:t xml:space="preserve">. Сначала я не мог её перенести из-за непонимания как работает </w:t>
-      </w:r>
-      <w:r>
-        <w:rPr>
-          <w:sz w:val="28"/>
-          <w:szCs w:val="28"/>
-          <w:lang w:val="en-US"/>
-        </w:rPr>
-        <w:t>PostgreSQL</w:t>
-      </w:r>
-      <w:r>
-        <w:rPr>
-          <w:sz w:val="28"/>
-          <w:szCs w:val="28"/>
-        </w:rPr>
-        <w:t xml:space="preserve">, ведь она явно сложнее в использовании, поэтому я начал разбираться. Для её </w:t>
-      </w:r>
-      <w:r>
-        <w:rPr>
-          <w:sz w:val="28"/>
-          <w:szCs w:val="28"/>
-        </w:rPr>
-        <w:t xml:space="preserve">внедрения в проект я скачал </w:t>
-      </w:r>
-      <w:r>
-        <w:rPr>
-          <w:sz w:val="28"/>
-          <w:szCs w:val="28"/>
-          <w:lang w:val="en-US"/>
-        </w:rPr>
-        <w:t>PostgreSQL</w:t>
-      </w:r>
-      <w:r>
-        <w:rPr>
-          <w:sz w:val="28"/>
-          <w:szCs w:val="28"/>
-        </w:rPr>
-        <w:t xml:space="preserve"> с сайта </w:t>
-      </w:r>
-      <w:proofErr w:type="spellStart"/>
-      <w:r>
-        <w:rPr>
-          <w:sz w:val="28"/>
-          <w:szCs w:val="28"/>
-        </w:rPr>
-        <w:t>EnterpriseDB</w:t>
-      </w:r>
-      <w:proofErr w:type="spellEnd"/>
-      <w:r>
-        <w:rPr>
-          <w:sz w:val="28"/>
-          <w:szCs w:val="28"/>
-        </w:rPr>
-        <w:t xml:space="preserve">, через командную строку создал базу данных и для отображения таблиц в ней я пользовался </w:t>
-      </w:r>
-      <w:proofErr w:type="spellStart"/>
-      <w:r>
-        <w:rPr>
-          <w:sz w:val="28"/>
-          <w:szCs w:val="28"/>
-          <w:lang w:val="en-US"/>
-        </w:rPr>
-        <w:t>PgAdmin</w:t>
-      </w:r>
-      <w:proofErr w:type="spellEnd"/>
-      <w:r>
-        <w:rPr>
-          <w:sz w:val="28"/>
-          <w:szCs w:val="28"/>
-        </w:rPr>
-        <w:t xml:space="preserve"> 4 и создал одну миграцию для всех таблиц сразу. </w:t>
-      </w:r>
-    </w:p>
-    <w:p>
-      <w:pPr>
-        <w:rPr>
-          <w:sz w:val="28"/>
-          <w:szCs w:val="28"/>
-        </w:rPr>
-      </w:pPr>
-      <w:r>
-        <w:rPr>
-          <w:sz w:val="28"/>
-          <w:szCs w:val="28"/>
-        </w:rPr>
-        <w:t xml:space="preserve">Занялся отображением </w:t>
-      </w:r>
-      <w:r>
-        <w:rPr>
-          <w:sz w:val="28"/>
-          <w:szCs w:val="28"/>
-        </w:rPr>
-        <w:t>списка категорий и сортировки транзакций по дате и категориям.</w:t>
-      </w:r>
     </w:p>
     <w:sectPr>
       <w:pgSz w:w="11906" w:h="16838"/>
@@ -1553,7 +1581,7 @@
 </file>
 
 <file path=customXml/itemProps1.xml><?xml version="1.0" encoding="utf-8"?>
-<ds:datastoreItem xmlns:ds="http://schemas.openxmlformats.org/officeDocument/2006/customXml" ds:itemID="{E59D8C77-67DC-4775-B85C-D1159385785E}">
+<ds:datastoreItem xmlns:ds="http://schemas.openxmlformats.org/officeDocument/2006/customXml" ds:itemID="{4603E21A-F4E8-4F04-AAF6-B5CEE3703FE0}">
   <ds:schemaRefs>
     <ds:schemaRef ds:uri="http://schemas.openxmlformats.org/officeDocument/2006/bibliography"/>
   </ds:schemaRefs>

</xml_diff>